<commit_message>
Adcionei o caso de uso 4 e atualizei o caso de uso 3
Coloquei a imagem de protótipo que estava faltanto no caso de uso 3
</commit_message>
<xml_diff>
--- a/GELO/1.Requisitos/Casos de Uso/GELO-US03-Excluir-Análise-ADM.docx
+++ b/GELO/1.Requisitos/Casos de Uso/GELO-US03-Excluir-Análise-ADM.docx
@@ -22,37 +22,7 @@
         <w:rPr>
           <w:lang w:val="pt-PT"/>
         </w:rPr>
-        <w:t>CS</w:t>
-      </w:r>
-      <w:r>
-        <w:rPr>
-          <w:lang w:val="pt-PT"/>
-        </w:rPr>
-        <w:t>3</w:t>
-      </w:r>
-      <w:r>
-        <w:rPr>
-          <w:lang w:val="pt-PT"/>
-        </w:rPr>
-        <w:t xml:space="preserve"> – </w:t>
-      </w:r>
-      <w:r>
-        <w:rPr>
-          <w:lang w:val="pt-PT"/>
-        </w:rPr>
-        <w:t xml:space="preserve">excluir análise </w:t>
-      </w:r>
-      <w:r>
-        <w:rPr>
-          <w:lang w:val="pt-PT"/>
-        </w:rPr>
-        <w:t>(ADM</w:t>
-      </w:r>
-      <w:r>
-        <w:rPr>
-          <w:lang w:val="pt-PT"/>
-        </w:rPr>
-        <w:t>)</w:t>
+        <w:t>CS3 – excluir análise (ADM)</w:t>
       </w:r>
     </w:p>
     <w:p>
@@ -66,11 +36,7 @@
       </w:pPr>
       <w:r>
         <w:rPr/>
-        <w:t>número da historia: UC</w:t>
-      </w:r>
-      <w:r>
-        <w:rPr/>
-        <w:t>3</w:t>
+        <w:t>número da historia: UC3</w:t>
       </w:r>
     </w:p>
     <w:p>
@@ -84,15 +50,7 @@
       </w:pPr>
       <w:r>
         <w:rPr/>
-        <w:t xml:space="preserve">estimativa: Cerca </w:t>
-      </w:r>
-      <w:r>
-        <w:rPr/>
-        <w:t>3</w:t>
-      </w:r>
-      <w:r>
-        <w:rPr/>
-        <w:t xml:space="preserve"> horas de desenvolvimento</w:t>
+        <w:t>estimativa: Cerca 3 horas de desenvolvimento</w:t>
       </w:r>
     </w:p>
     <w:p>
@@ -178,15 +136,7 @@
           <w:i w:val="false"/>
           <w:color w:val="auto"/>
         </w:rPr>
-        <w:t>mantenha a comunidade do sistema saudável</w:t>
-      </w:r>
-      <w:r>
-        <w:rPr>
-          <w:b/>
-          <w:i w:val="false"/>
-          <w:color w:val="auto"/>
-        </w:rPr>
-        <w:t>.</w:t>
+        <w:t>mantenha a comunidade do sistema saudável.</w:t>
       </w:r>
     </w:p>
     <w:p>
@@ -224,11 +174,7 @@
       </w:r>
       <w:r>
         <w:rPr/>
-        <w:t xml:space="preserve">: </w:t>
-      </w:r>
-      <w:r>
-        <w:rPr/>
-        <w:t>Estar logado no sistema com sua conta de usuário</w:t>
+        <w:t>: Estar logado no sistema com sua conta de usuário</w:t>
       </w:r>
     </w:p>
     <w:p>
@@ -464,18 +410,7 @@
                 <w:szCs w:val="20"/>
                 <w:lang w:eastAsia="pt-BR" w:bidi="ar-SA"/>
               </w:rPr>
-              <w:t>E</w:t>
-            </w:r>
-            <w:r>
-              <w:rPr>
-                <w:rFonts w:eastAsia="Times New Roman"/>
-                <w:color w:val="auto"/>
-                <w:kern w:val="0"/>
-                <w:sz w:val="20"/>
-                <w:szCs w:val="20"/>
-                <w:lang w:eastAsia="pt-BR" w:bidi="ar-SA"/>
-              </w:rPr>
-              <w:t xml:space="preserve">xcluir alguma análise feito por um usuário que tenha quebrado as diretrizes do sistema </w:t>
+              <w:t>Excluir alguma análise feito por um usuário que tenha quebrado as diretrizes do sistema</w:t>
             </w:r>
           </w:p>
         </w:tc>
@@ -531,18 +466,7 @@
                 <w:szCs w:val="20"/>
                 <w:lang w:eastAsia="pt-BR" w:bidi="ar-SA"/>
               </w:rPr>
-              <w:t xml:space="preserve">O administrador </w:t>
-            </w:r>
-            <w:r>
-              <w:rPr>
-                <w:rFonts w:eastAsia="Times New Roman"/>
-                <w:color w:val="auto"/>
-                <w:kern w:val="0"/>
-                <w:sz w:val="20"/>
-                <w:szCs w:val="20"/>
-                <w:lang w:eastAsia="pt-BR" w:bidi="ar-SA"/>
-              </w:rPr>
-              <w:t>excluirá alguma análise feita por um usuário que tenha quebrado algumas das diretrizes do sistema, com análises ofensivas ou com discurso de ódio</w:t>
+              <w:t>O administrador excluirá alguma análise feita por um usuário que tenha quebrado algumas das diretrizes do sistema, com análises ofensivas ou com discurso de ódio</w:t>
             </w:r>
           </w:p>
         </w:tc>
@@ -587,16 +511,83 @@
         </w:rPr>
       </w:pPr>
       <w:r>
-        <w:rPr/>
+        <w:rPr>
+          <w:i w:val="false"/>
+          <w:color w:val="auto"/>
+        </w:rPr>
+      </w:r>
+      <w:r>
+        <w:br w:type="page"/>
+      </w:r>
+    </w:p>
+    <w:p>
+      <w:pPr>
+        <w:pStyle w:val="EPP-Comentario"/>
+        <w:rPr>
+          <w:i w:val="false"/>
+          <w:i w:val="false"/>
+          <w:color w:val="auto"/>
+        </w:rPr>
+      </w:pPr>
+      <w:r>
+        <w:rPr>
+          <w:i w:val="false"/>
+          <w:color w:val="auto"/>
+        </w:rPr>
+        <w:drawing>
+          <wp:anchor behindDoc="0" distT="0" distB="0" distL="0" distR="0" simplePos="0" locked="0" layoutInCell="0" allowOverlap="1" relativeHeight="4">
+            <wp:simplePos x="0" y="0"/>
+            <wp:positionH relativeFrom="column">
+              <wp:posOffset>982980</wp:posOffset>
+            </wp:positionH>
+            <wp:positionV relativeFrom="paragraph">
+              <wp:posOffset>15875</wp:posOffset>
+            </wp:positionV>
+            <wp:extent cx="4307205" cy="8444865"/>
+            <wp:effectExtent l="0" t="0" r="0" b="0"/>
+            <wp:wrapSquare wrapText="largest"/>
+            <wp:docPr id="1" name="Figura1" descr=""/>
+            <wp:cNvGraphicFramePr>
+              <a:graphicFrameLocks xmlns:a="http://schemas.openxmlformats.org/drawingml/2006/main" noChangeAspect="1"/>
+            </wp:cNvGraphicFramePr>
+            <a:graphic xmlns:a="http://schemas.openxmlformats.org/drawingml/2006/main">
+              <a:graphicData uri="http://schemas.openxmlformats.org/drawingml/2006/picture">
+                <pic:pic xmlns:pic="http://schemas.openxmlformats.org/drawingml/2006/picture">
+                  <pic:nvPicPr>
+                    <pic:cNvPr id="1" name="Figura1" descr=""/>
+                    <pic:cNvPicPr>
+                      <a:picLocks noChangeAspect="1" noChangeArrowheads="1"/>
+                    </pic:cNvPicPr>
+                  </pic:nvPicPr>
+                  <pic:blipFill>
+                    <a:blip r:embed="rId2"/>
+                    <a:stretch>
+                      <a:fillRect/>
+                    </a:stretch>
+                  </pic:blipFill>
+                  <pic:spPr bwMode="auto">
+                    <a:xfrm>
+                      <a:off x="0" y="0"/>
+                      <a:ext cx="4307205" cy="8444865"/>
+                    </a:xfrm>
+                    <a:prstGeom prst="rect">
+                      <a:avLst/>
+                    </a:prstGeom>
+                  </pic:spPr>
+                </pic:pic>
+              </a:graphicData>
+            </a:graphic>
+          </wp:anchor>
+        </w:drawing>
       </w:r>
     </w:p>
     <w:sectPr>
-      <w:headerReference w:type="even" r:id="rId2"/>
-      <w:headerReference w:type="default" r:id="rId3"/>
-      <w:headerReference w:type="first" r:id="rId4"/>
-      <w:footerReference w:type="even" r:id="rId5"/>
-      <w:footerReference w:type="default" r:id="rId6"/>
-      <w:footerReference w:type="first" r:id="rId7"/>
+      <w:headerReference w:type="even" r:id="rId3"/>
+      <w:headerReference w:type="default" r:id="rId4"/>
+      <w:headerReference w:type="first" r:id="rId5"/>
+      <w:footerReference w:type="even" r:id="rId6"/>
+      <w:footerReference w:type="default" r:id="rId7"/>
+      <w:footerReference w:type="first" r:id="rId8"/>
       <w:type w:val="nextPage"/>
       <w:pgSz w:w="11906" w:h="16838"/>
       <w:pgMar w:left="1418" w:right="851" w:gutter="0" w:header="851" w:top="908" w:footer="851" w:bottom="908"/>
@@ -649,8 +640,8 @@
       <w:tblLook w:val="0000" w:noHBand="0" w:noVBand="0" w:firstColumn="0" w:lastRow="0" w:lastColumn="0" w:firstRow="0"/>
     </w:tblPr>
     <w:tblGrid>
-      <w:gridCol w:w="8342"/>
-      <w:gridCol w:w="162"/>
+      <w:gridCol w:w="8341"/>
+      <w:gridCol w:w="163"/>
       <w:gridCol w:w="1206"/>
     </w:tblGrid>
     <w:tr>
@@ -659,7 +650,7 @@
       </w:trPr>
       <w:tc>
         <w:tcPr>
-          <w:tcW w:w="8342" w:type="dxa"/>
+          <w:tcW w:w="8341" w:type="dxa"/>
           <w:tcBorders>
             <w:top w:val="single" w:sz="12" w:space="0" w:color="000000"/>
           </w:tcBorders>
@@ -711,7 +702,7 @@
       </w:tc>
       <w:tc>
         <w:tcPr>
-          <w:tcW w:w="162" w:type="dxa"/>
+          <w:tcW w:w="163" w:type="dxa"/>
           <w:tcBorders>
             <w:top w:val="single" w:sz="12" w:space="0" w:color="000000"/>
           </w:tcBorders>
@@ -775,7 +766,7 @@
           </w:r>
           <w:r>
             <w:rPr/>
-            <w:t>1</w:t>
+            <w:t>2</w:t>
           </w:r>
           <w:r>
             <w:rPr/>
@@ -799,7 +790,7 @@
           </w:r>
           <w:r>
             <w:rPr/>
-            <w:t>1</w:t>
+            <w:t>2</w:t>
           </w:r>
           <w:r>
             <w:rPr/>
@@ -869,8 +860,8 @@
       <w:tblLook w:val="0000" w:noHBand="0" w:noVBand="0" w:firstColumn="0" w:lastRow="0" w:lastColumn="0" w:firstRow="0"/>
     </w:tblPr>
     <w:tblGrid>
-      <w:gridCol w:w="8342"/>
-      <w:gridCol w:w="162"/>
+      <w:gridCol w:w="8341"/>
+      <w:gridCol w:w="163"/>
       <w:gridCol w:w="1206"/>
     </w:tblGrid>
     <w:tr>
@@ -879,7 +870,7 @@
       </w:trPr>
       <w:tc>
         <w:tcPr>
-          <w:tcW w:w="8342" w:type="dxa"/>
+          <w:tcW w:w="8341" w:type="dxa"/>
           <w:tcBorders>
             <w:top w:val="single" w:sz="12" w:space="0" w:color="000000"/>
           </w:tcBorders>
@@ -931,7 +922,7 @@
       </w:tc>
       <w:tc>
         <w:tcPr>
-          <w:tcW w:w="162" w:type="dxa"/>
+          <w:tcW w:w="163" w:type="dxa"/>
           <w:tcBorders>
             <w:top w:val="single" w:sz="12" w:space="0" w:color="000000"/>
           </w:tcBorders>
@@ -995,7 +986,7 @@
           </w:r>
           <w:r>
             <w:rPr/>
-            <w:t>1</w:t>
+            <w:t>2</w:t>
           </w:r>
           <w:r>
             <w:rPr/>
@@ -1019,7 +1010,7 @@
           </w:r>
           <w:r>
             <w:rPr/>
-            <w:t>1</w:t>
+            <w:t>2</w:t>
           </w:r>
           <w:r>
             <w:rPr/>
@@ -1094,8 +1085,8 @@
       <w:tblLook w:val="0000" w:noHBand="0" w:noVBand="0" w:firstColumn="0" w:lastRow="0" w:lastColumn="0" w:firstRow="0"/>
     </w:tblPr>
     <w:tblGrid>
-      <w:gridCol w:w="1438"/>
-      <w:gridCol w:w="6842"/>
+      <w:gridCol w:w="1437"/>
+      <w:gridCol w:w="6843"/>
       <w:gridCol w:w="1440"/>
     </w:tblGrid>
     <w:tr>
@@ -1104,7 +1095,7 @@
       </w:trPr>
       <w:tc>
         <w:tcPr>
-          <w:tcW w:w="1438" w:type="dxa"/>
+          <w:tcW w:w="1437" w:type="dxa"/>
           <w:tcBorders>
             <w:bottom w:val="single" w:sz="12" w:space="0" w:color="000000"/>
           </w:tcBorders>
@@ -1124,7 +1115,7 @@
               <wp:inline distT="0" distB="0" distL="0" distR="0">
                 <wp:extent cx="440055" cy="440055"/>
                 <wp:effectExtent l="0" t="0" r="0" b="0"/>
-                <wp:docPr id="1" name="Imagem 1" descr="Logotipo do livro Imagens – Download Grátis no Magnific (antes Freepik)"/>
+                <wp:docPr id="2" name="Imagem 1" descr="Logotipo do livro Imagens – Download Grátis no Magnific (antes Freepik)"/>
                 <wp:cNvGraphicFramePr>
                   <a:graphicFrameLocks xmlns:a="http://schemas.openxmlformats.org/drawingml/2006/main" noChangeAspect="1"/>
                 </wp:cNvGraphicFramePr>
@@ -1132,7 +1123,7 @@
                   <a:graphicData uri="http://schemas.openxmlformats.org/drawingml/2006/picture">
                     <pic:pic xmlns:pic="http://schemas.openxmlformats.org/drawingml/2006/picture">
                       <pic:nvPicPr>
-                        <pic:cNvPr id="1" name="Imagem 1" descr="Logotipo do livro Imagens – Download Grátis no Magnific (antes Freepik)"/>
+                        <pic:cNvPr id="2" name="Imagem 1" descr="Logotipo do livro Imagens – Download Grátis no Magnific (antes Freepik)"/>
                         <pic:cNvPicPr>
                           <a:picLocks noChangeAspect="1" noChangeArrowheads="1"/>
                         </pic:cNvPicPr>
@@ -1162,7 +1153,7 @@
       </w:tc>
       <w:tc>
         <w:tcPr>
-          <w:tcW w:w="6842" w:type="dxa"/>
+          <w:tcW w:w="6843" w:type="dxa"/>
           <w:tcBorders>
             <w:bottom w:val="single" w:sz="12" w:space="0" w:color="000000"/>
           </w:tcBorders>
@@ -1251,8 +1242,8 @@
       <w:tblLook w:val="0000" w:noHBand="0" w:noVBand="0" w:firstColumn="0" w:lastRow="0" w:lastColumn="0" w:firstRow="0"/>
     </w:tblPr>
     <w:tblGrid>
-      <w:gridCol w:w="1438"/>
-      <w:gridCol w:w="6842"/>
+      <w:gridCol w:w="1437"/>
+      <w:gridCol w:w="6843"/>
       <w:gridCol w:w="1440"/>
     </w:tblGrid>
     <w:tr>
@@ -1261,7 +1252,7 @@
       </w:trPr>
       <w:tc>
         <w:tcPr>
-          <w:tcW w:w="1438" w:type="dxa"/>
+          <w:tcW w:w="1437" w:type="dxa"/>
           <w:tcBorders>
             <w:bottom w:val="single" w:sz="12" w:space="0" w:color="000000"/>
           </w:tcBorders>
@@ -1281,7 +1272,7 @@
               <wp:inline distT="0" distB="0" distL="0" distR="0">
                 <wp:extent cx="440055" cy="440055"/>
                 <wp:effectExtent l="0" t="0" r="0" b="0"/>
-                <wp:docPr id="2" name="Imagem 1" descr="Logotipo do livro Imagens – Download Grátis no Magnific (antes Freepik)"/>
+                <wp:docPr id="3" name="Imagem 1" descr="Logotipo do livro Imagens – Download Grátis no Magnific (antes Freepik)"/>
                 <wp:cNvGraphicFramePr>
                   <a:graphicFrameLocks xmlns:a="http://schemas.openxmlformats.org/drawingml/2006/main" noChangeAspect="1"/>
                 </wp:cNvGraphicFramePr>
@@ -1289,7 +1280,7 @@
                   <a:graphicData uri="http://schemas.openxmlformats.org/drawingml/2006/picture">
                     <pic:pic xmlns:pic="http://schemas.openxmlformats.org/drawingml/2006/picture">
                       <pic:nvPicPr>
-                        <pic:cNvPr id="2" name="Imagem 1" descr="Logotipo do livro Imagens – Download Grátis no Magnific (antes Freepik)"/>
+                        <pic:cNvPr id="3" name="Imagem 1" descr="Logotipo do livro Imagens – Download Grátis no Magnific (antes Freepik)"/>
                         <pic:cNvPicPr>
                           <a:picLocks noChangeAspect="1" noChangeArrowheads="1"/>
                         </pic:cNvPicPr>
@@ -1319,7 +1310,7 @@
       </w:tc>
       <w:tc>
         <w:tcPr>
-          <w:tcW w:w="6842" w:type="dxa"/>
+          <w:tcW w:w="6843" w:type="dxa"/>
           <w:tcBorders>
             <w:bottom w:val="single" w:sz="12" w:space="0" w:color="000000"/>
           </w:tcBorders>

</xml_diff>